<commit_message>
Improve Viamericas post: partner-association trends + cross-link MLB post
Add a "bigger picture" section tying remittance to wealth-building
communities, citing partner associations NAHREP (record 10.2M Hispanic
homeowners, 2025) and AREAA (AAPI homeownership surge). Cross-link the
companion MLB post to build engagement as a collective, add TransPerfect
CTA. All sources linked inline; no em dashes. Updated markdown and Word.

Co-Authored-By: Claude Opus 4.8 <noreply@anthropic.com>
Claude-Session: https://claude.ai/code/session_01WdmaS8fb3WHmxD5MVo6UfL
</commit_message>
<xml_diff>
--- a/blog/NYCFC-Viamericas-Remittance-Partner.docx
+++ b/blog/NYCFC-Viamericas-Remittance-Partner.docx
@@ -29,7 +29,7 @@
           <w:sz w:val="22"/>
           <w:szCs w:val="22"/>
         </w:rPr>
-        <w:t xml:space="preserve">A remittance brand buys its way onto the kit, and closer to the communities that send money home.</w:t>
+        <w:t xml:space="preserve">A remittance brand buys its way onto the kit, and closer to the fast-rising communities that send money home and buy homes here.</w:t>
       </w:r>
     </w:p>
     <w:p>
@@ -85,7 +85,7 @@
         </w:rPr>
         <w:t xml:space="preserve"> its Official International Money Transfer and Remittance Partner, the club </w:t>
       </w:r>
-      <w:hyperlink w:history="1" r:id="rId4czsumzeuzyxhmr0esk9f">
+      <w:hyperlink w:history="1" r:id="rIdxmgdbqdts260gzjtfu1li">
         <w:r>
           <w:rPr>
             <w:rStyle w:val="Hyperlink"/>
@@ -102,7 +102,7 @@
         </w:rPr>
         <w:t xml:space="preserve">. The deal gives Viamericas a prominent, first-of-its-kind spot: its brand becomes the </w:t>
       </w:r>
-      <w:hyperlink w:history="1" r:id="rIdcaayjrxwd2se-s-npghaf">
+      <w:hyperlink w:history="1" r:id="rIdr8jlqxksto_5zfl8dssnx">
         <w:r>
           <w:rPr>
             <w:rStyle w:val="Hyperlink"/>
@@ -140,7 +140,7 @@
         </w:rPr>
         <w:t xml:space="preserve">Viamericas is one of the largest licensed U.S. money transfer companies, serving families across </w:t>
       </w:r>
-      <w:hyperlink w:history="1" r:id="rIdvjibsfcbh5t7wt-7onmrs">
+      <w:hyperlink w:history="1" r:id="rIdqwswqfmd4xsl6mm3aqod8">
         <w:r>
           <w:rPr>
             <w:rStyle w:val="Hyperlink"/>
@@ -178,7 +178,7 @@
         </w:rPr>
         <w:t xml:space="preserve">The NYCFC sponsorship lands amid an aggressive growth push. In September 2025, Viamericas </w:t>
       </w:r>
-      <w:hyperlink w:history="1" r:id="rIdqwvtkulvoawcbkkk2phfq">
+      <w:hyperlink w:history="1" r:id="rIddi2voacthf_ojwmwra0bf">
         <w:r>
           <w:rPr>
             <w:rStyle w:val="Hyperlink"/>
@@ -198,24 +198,227 @@
     </w:p>
     <w:p>
       <w:pPr>
-        <w:spacing w:after="160" w:line="288"/>
+        <w:pStyle w:val="Heading2"/>
+        <w:spacing w:after="120" w:before="260"/>
       </w:pPr>
       <w:r>
         <w:rPr>
           <w:b/>
           <w:bCs/>
-          <w:sz w:val="22"/>
-          <w:szCs w:val="22"/>
-        </w:rPr>
-        <w:t xml:space="preserve">Why it matters. </w:t>
-      </w:r>
-      <w:r>
-        <w:rPr>
-          <w:sz w:val="22"/>
-          <w:szCs w:val="22"/>
-        </w:rPr>
-        <w:t xml:space="preserve">Sports sponsorship is fast becoming the on-ramp to multicultural, cross-border customers. Just as card issuers court Latino baseball fans, Viamericas is using the pitch to reach the communities that send money home, meeting them where their passion, and their financial needs, already are.</w:t>
-      </w:r>
+          <w:color w:val="4B3FBF"/>
+          <w:sz w:val="26"/>
+          <w:szCs w:val="26"/>
+        </w:rPr>
+        <w:t xml:space="preserve">The bigger picture: remittance is just the entry point</w:t>
+      </w:r>
+    </w:p>
+    <w:p>
+      <w:pPr>
+        <w:spacing w:after="160" w:line="288"/>
+      </w:pPr>
+      <w:r>
+        <w:rPr>
+          <w:sz w:val="22"/>
+          <w:szCs w:val="22"/>
+        </w:rPr>
+        <w:t xml:space="preserve">The communities Viamericas serves aren’t only sending money home, they’re the fastest-rising economic force in the U.S. market. Per our partners at </w:t>
+      </w:r>
+      <w:r>
+        <w:rPr>
+          <w:b/>
+          <w:bCs/>
+          <w:sz w:val="22"/>
+          <w:szCs w:val="22"/>
+        </w:rPr>
+        <w:t xml:space="preserve">NAHREP</w:t>
+      </w:r>
+      <w:r>
+        <w:rPr>
+          <w:sz w:val="22"/>
+          <w:szCs w:val="22"/>
+        </w:rPr>
+        <w:t xml:space="preserve">, Hispanics reached a </w:t>
+      </w:r>
+      <w:hyperlink w:history="1" r:id="rIdmt2lgckvjoeetlwwfsoas">
+        <w:r>
+          <w:rPr>
+            <w:rStyle w:val="Hyperlink"/>
+            <w:sz w:val="22"/>
+            <w:szCs w:val="22"/>
+          </w:rPr>
+          <w:t xml:space="preserve">record 10.2 million homeowners in 2025</w:t>
+        </w:r>
+      </w:hyperlink>
+      <w:r>
+        <w:rPr>
+          <w:sz w:val="22"/>
+          <w:szCs w:val="22"/>
+        </w:rPr>
+        <w:t xml:space="preserve">, a net gain of 441,000 in a year when most other groups declined (</w:t>
+      </w:r>
+      <w:hyperlink w:history="1" r:id="rId5jcrtwoj73bfmx0dcxolx">
+        <w:r>
+          <w:rPr>
+            <w:rStyle w:val="Hyperlink"/>
+            <w:sz w:val="22"/>
+            <w:szCs w:val="22"/>
+          </w:rPr>
+          <w:t xml:space="preserve">State of Hispanic Homeownership Report</w:t>
+        </w:r>
+      </w:hyperlink>
+      <w:r>
+        <w:rPr>
+          <w:sz w:val="22"/>
+          <w:szCs w:val="22"/>
+        </w:rPr>
+        <w:t xml:space="preserve">). The </w:t>
+      </w:r>
+      <w:r>
+        <w:rPr>
+          <w:b/>
+          <w:bCs/>
+          <w:sz w:val="22"/>
+          <w:szCs w:val="22"/>
+        </w:rPr>
+        <w:t xml:space="preserve">AAPI</w:t>
+      </w:r>
+      <w:r>
+        <w:rPr>
+          <w:sz w:val="22"/>
+          <w:szCs w:val="22"/>
+        </w:rPr>
+        <w:t xml:space="preserve"> community is on a parallel climb, with </w:t>
+      </w:r>
+      <w:r>
+        <w:rPr>
+          <w:b/>
+          <w:bCs/>
+          <w:sz w:val="22"/>
+          <w:szCs w:val="22"/>
+        </w:rPr>
+        <w:t xml:space="preserve">AREAA’s</w:t>
+      </w:r>
+      <w:r>
+        <w:rPr>
+          <w:sz w:val="22"/>
+          <w:szCs w:val="22"/>
+        </w:rPr>
+        <w:t xml:space="preserve"> </w:t>
+      </w:r>
+      <w:hyperlink w:history="1" r:id="rIdgjvfzvvonpo_pw0tzaehl">
+        <w:r>
+          <w:rPr>
+            <w:rStyle w:val="Hyperlink"/>
+            <w:sz w:val="22"/>
+            <w:szCs w:val="22"/>
+          </w:rPr>
+          <w:t xml:space="preserve">State of Asia America Report</w:t>
+        </w:r>
+      </w:hyperlink>
+      <w:r>
+        <w:rPr>
+          <w:sz w:val="22"/>
+          <w:szCs w:val="22"/>
+        </w:rPr>
+        <w:t xml:space="preserve"> documenting a multi-year </w:t>
+      </w:r>
+      <w:hyperlink w:history="1" r:id="rIdwpyp3k0m_36hkkl475gxl">
+        <w:r>
+          <w:rPr>
+            <w:rStyle w:val="Hyperlink"/>
+            <w:sz w:val="22"/>
+            <w:szCs w:val="22"/>
+          </w:rPr>
+          <w:t xml:space="preserve">surge in AAPI homeownership</w:t>
+        </w:r>
+      </w:hyperlink>
+      <w:r>
+        <w:rPr>
+          <w:sz w:val="22"/>
+          <w:szCs w:val="22"/>
+        </w:rPr>
+        <w:t xml:space="preserve">.</w:t>
+      </w:r>
+    </w:p>
+    <w:p>
+      <w:pPr>
+        <w:spacing w:after="160" w:line="288"/>
+      </w:pPr>
+      <w:r>
+        <w:rPr>
+          <w:sz w:val="22"/>
+          <w:szCs w:val="22"/>
+        </w:rPr>
+        <w:t xml:space="preserve">That is the real prize behind a remittance sponsorship. A customer who first trusts you to send $200 home is a future cardholder, depositor, and mortgage borrower, if the relationship is built in their language across every product. Sponsorship buys the reach; in-language experience turns a single transfer into a lifetime relationship.</w:t>
+      </w:r>
+    </w:p>
+    <w:p>
+      <w:pPr>
+        <w:spacing w:after="160" w:line="288"/>
+      </w:pPr>
+      <w:r>
+        <w:rPr>
+          <w:b/>
+          <w:bCs/>
+          <w:sz w:val="22"/>
+          <w:szCs w:val="22"/>
+        </w:rPr>
+        <w:t xml:space="preserve">Related reading: </w:t>
+      </w:r>
+      <w:hyperlink w:history="1" r:id="rIdxfxulhklsdhj_te8ceoz9">
+        <w:r>
+          <w:rPr>
+            <w:rStyle w:val="Hyperlink"/>
+            <w:sz w:val="22"/>
+            <w:szCs w:val="22"/>
+          </w:rPr>
+          <w:t xml:space="preserve">Buying Loyalty in a Second Language: What Capital One’s MLB Bet Teaches Banks About Multicultural Trust</w:t>
+        </w:r>
+      </w:hyperlink>
+      <w:r>
+        <w:rPr>
+          <w:i/>
+          <w:iCs/>
+          <w:sz w:val="22"/>
+          <w:szCs w:val="22"/>
+        </w:rPr>
+        <w:t xml:space="preserve"> (swap for live URL), our take on why language is the conversion layer most issuers aren’t pricing.</w:t>
+      </w:r>
+    </w:p>
+    <w:p>
+      <w:pPr>
+        <w:pBdr>
+          <w:bottom w:val="single" w:color="CCCCCC" w:sz="6" w:space="1"/>
+        </w:pBdr>
+        <w:spacing w:after="160" w:before="160"/>
+      </w:pPr>
+      <w:r>
+        <w:t xml:space="preserve"/>
+      </w:r>
+    </w:p>
+    <w:p>
+      <w:pPr>
+        <w:spacing w:after="160" w:line="288"/>
+      </w:pPr>
+      <w:r>
+        <w:rPr>
+          <w:i/>
+          <w:iCs/>
+          <w:sz w:val="22"/>
+          <w:szCs w:val="22"/>
+        </w:rPr>
+        <w:t xml:space="preserve">TransPerfect helps banks, card issuers, fintechs, and money-transfer providers deliver secure, compliant, in-language customer experiences at scale, from onboarding and apps to servicing and disclosures. </w:t>
+      </w:r>
+      <w:hyperlink w:history="1" r:id="rIdsoygr366aeeollyqqbiiu">
+        <w:r>
+          <w:rPr>
+            <w:rStyle w:val="Hyperlink"/>
+            <w:sz w:val="22"/>
+            <w:szCs w:val="22"/>
+          </w:rPr>
+          <w:t xml:space="preserve">Explore our finance and banking language solutions »</w:t>
+        </w:r>
+      </w:hyperlink>
     </w:p>
     <w:p>
       <w:pPr>
@@ -259,7 +462,7 @@
         </w:rPr>
         <w:t xml:space="preserve">NYCFC Announce Viamericas as Official International Money Transfer &amp; Remittance Partner (Aug 11, 2026): </w:t>
       </w:r>
-      <w:hyperlink w:history="1" r:id="rIdk4lopsvgct8golgnrsgme">
+      <w:hyperlink w:history="1" r:id="rId0_13ebfjvepmdwakveiru">
         <w:r>
           <w:rPr>
             <w:rStyle w:val="Hyperlink"/>
@@ -276,7 +479,7 @@
         </w:rPr>
         <w:t xml:space="preserve">  ·  </w:t>
       </w:r>
-      <w:hyperlink w:history="1" r:id="rIdbxht94brzd8cj-mgyfimz">
+      <w:hyperlink w:history="1" r:id="rIdoaogawykd_urlvjmohtlw">
         <w:r>
           <w:rPr>
             <w:rStyle w:val="Hyperlink"/>
@@ -293,7 +496,7 @@
         </w:rPr>
         <w:t xml:space="preserve">  ·  </w:t>
       </w:r>
-      <w:hyperlink w:history="1" r:id="rIdx2s89qy_rjqeaofj0ryas">
+      <w:hyperlink w:history="1" r:id="rIdtcvcxhgo8g4hgqeidaaqd">
         <w:r>
           <w:rPr>
             <w:rStyle w:val="Hyperlink"/>
@@ -320,7 +523,7 @@
         </w:rPr>
         <w:t xml:space="preserve">Viamericas Raises $113.6M to Expand Global Remittance Network Serving 95 Countries (Sep 2025): </w:t>
       </w:r>
-      <w:hyperlink w:history="1" r:id="rId9vp6fivwmi3jxhxtzo0gi">
+      <w:hyperlink w:history="1" r:id="rId78zjfccrgsq8qg2bw6sr6">
         <w:r>
           <w:rPr>
             <w:rStyle w:val="Hyperlink"/>
@@ -337,7 +540,7 @@
         </w:rPr>
         <w:t xml:space="preserve">  ·  </w:t>
       </w:r>
-      <w:hyperlink w:history="1" r:id="rIdijvgcm_s5qj2bqcx7q3ug">
+      <w:hyperlink w:history="1" r:id="rIdmk9g2ydxqcozmfjhyk9z_">
         <w:r>
           <w:rPr>
             <w:rStyle w:val="Hyperlink"/>
@@ -347,6 +550,128 @@
           <w:t xml:space="preserve">FinTech Futures</w:t>
         </w:r>
       </w:hyperlink>
+    </w:p>
+    <w:p>
+      <w:pPr>
+        <w:pStyle w:val="ListParagraph"/>
+        <w:numPr>
+          <w:ilvl w:val="0"/>
+          <w:numId w:val="2"/>
+        </w:numPr>
+        <w:spacing w:after="110" w:line="276"/>
+      </w:pPr>
+      <w:r>
+        <w:rPr>
+          <w:sz w:val="20"/>
+          <w:szCs w:val="20"/>
+        </w:rPr>
+        <w:t xml:space="preserve">NAHREP, 2025 State of Hispanic Homeownership Report (record 10.2M Hispanic homeowners): </w:t>
+      </w:r>
+      <w:hyperlink w:history="1" r:id="rIdfdhoteibz5mvc3n-6gqs2">
+        <w:r>
+          <w:rPr>
+            <w:rStyle w:val="Hyperlink"/>
+            <w:sz w:val="20"/>
+            <w:szCs w:val="20"/>
+          </w:rPr>
+          <w:t xml:space="preserve">Report</w:t>
+        </w:r>
+      </w:hyperlink>
+      <w:r>
+        <w:rPr>
+          <w:sz w:val="20"/>
+          <w:szCs w:val="20"/>
+        </w:rPr>
+        <w:t xml:space="preserve">  ·  </w:t>
+      </w:r>
+      <w:hyperlink w:history="1" r:id="rIdfkyq5gjcca_n6ogp1t02k">
+        <w:r>
+          <w:rPr>
+            <w:rStyle w:val="Hyperlink"/>
+            <w:sz w:val="20"/>
+            <w:szCs w:val="20"/>
+          </w:rPr>
+          <w:t xml:space="preserve">Press release</w:t>
+        </w:r>
+      </w:hyperlink>
+    </w:p>
+    <w:p>
+      <w:pPr>
+        <w:pStyle w:val="ListParagraph"/>
+        <w:numPr>
+          <w:ilvl w:val="0"/>
+          <w:numId w:val="2"/>
+        </w:numPr>
+        <w:spacing w:after="110" w:line="276"/>
+      </w:pPr>
+      <w:r>
+        <w:rPr>
+          <w:sz w:val="20"/>
+          <w:szCs w:val="20"/>
+        </w:rPr>
+        <w:t xml:space="preserve">AREAA, State of Asia America Report (AAPI homeownership surge): </w:t>
+      </w:r>
+      <w:hyperlink w:history="1" r:id="rIdc-zhfamillie4uckcpv6e">
+        <w:r>
+          <w:rPr>
+            <w:rStyle w:val="Hyperlink"/>
+            <w:sz w:val="20"/>
+            <w:szCs w:val="20"/>
+          </w:rPr>
+          <w:t xml:space="preserve">AREAA</w:t>
+        </w:r>
+      </w:hyperlink>
+      <w:r>
+        <w:rPr>
+          <w:sz w:val="20"/>
+          <w:szCs w:val="20"/>
+        </w:rPr>
+        <w:t xml:space="preserve">  ·  </w:t>
+      </w:r>
+      <w:hyperlink w:history="1" r:id="rId2-wvf271a-_n57rifhyhy">
+        <w:r>
+          <w:rPr>
+            <w:rStyle w:val="Hyperlink"/>
+            <w:sz w:val="20"/>
+            <w:szCs w:val="20"/>
+          </w:rPr>
+          <w:t xml:space="preserve">NAR coverage</w:t>
+        </w:r>
+      </w:hyperlink>
+    </w:p>
+    <w:p>
+      <w:pPr>
+        <w:pStyle w:val="ListParagraph"/>
+        <w:numPr>
+          <w:ilvl w:val="0"/>
+          <w:numId w:val="2"/>
+        </w:numPr>
+        <w:spacing w:after="110" w:line="276"/>
+      </w:pPr>
+      <w:r>
+        <w:rPr>
+          <w:sz w:val="20"/>
+          <w:szCs w:val="20"/>
+        </w:rPr>
+        <w:t xml:space="preserve">Related: </w:t>
+      </w:r>
+      <w:hyperlink w:history="1" r:id="rIdfwdwjwp338c1lvi8c4a0h">
+        <w:r>
+          <w:rPr>
+            <w:rStyle w:val="Hyperlink"/>
+            <w:sz w:val="20"/>
+            <w:szCs w:val="20"/>
+          </w:rPr>
+          <w:t xml:space="preserve">Buying Loyalty in a Second Language</w:t>
+        </w:r>
+      </w:hyperlink>
+      <w:r>
+        <w:rPr>
+          <w:sz w:val="20"/>
+          <w:szCs w:val="20"/>
+        </w:rPr>
+        <w:t xml:space="preserve"> (TransPerfect)</w:t>
+      </w:r>
     </w:p>
     <w:sectPr>
       <w:pgSz w:w="12240" w:h="15840" w:orient="portrait"/>

</xml_diff>